<commit_message>
docs: strengthen ERP consultant project evidence
</commit_message>
<xml_diff>
--- a/Project-ERP-Implementation-Consultant/docs/Week2_Module_Configuration_Blueprint.docx
+++ b/Project-ERP-Implementation-Consultant/docs/Week2_Module_Configuration_Blueprint.docx
@@ -61,7 +61,7 @@
                 <w:color w:val="5B4A00"/>
                 <w:sz w:val="18"/>
               </w:rPr>
-              <w:t>SIMULATED DESIGN ONLY — This document describes proposed settings and tests. No SAP or other ERP tenant was configured, and no screenshot is presented as a live-system capture.</w:t>
+              <w:t>SIMULATED DESIGN ONLY — No SAP or other ERP tenant was configured. Any static mock-up is illustrative training evidence, not a live-system screenshot.</w:t>
             </w:r>
           </w:p>
         </w:tc>
@@ -630,6 +630,52 @@
     <w:p>
       <w:r>
         <w:t>The detailed spreadsheet-ready decision register is in data/week2_configuration_blueprint.csv. Each row is a proposed design position, not a recorded configuration change. A functional lead should confirm local tax, valuation, quality, approval and planning requirements before converting these positions into product-specific settings.</w:t>
+      </w:r>
+    </w:p>
+    <w:p>
+      <w:r>
+        <w:drawing>
+          <wp:inline xmlns:a="http://schemas.openxmlformats.org/drawingml/2006/main" xmlns:pic="http://schemas.openxmlformats.org/drawingml/2006/picture">
+            <wp:extent cx="6126480" cy="3185770"/>
+            <wp:docPr id="2" name="Picture 2"/>
+            <wp:cNvGraphicFramePr>
+              <a:graphicFrameLocks noChangeAspect="1"/>
+            </wp:cNvGraphicFramePr>
+            <a:graphic>
+              <a:graphicData uri="http://schemas.openxmlformats.org/drawingml/2006/picture">
+                <pic:pic>
+                  <pic:nvPicPr>
+                    <pic:cNvPr id="0" name="week2_configuration_record_mockup.png"/>
+                    <pic:cNvPicPr/>
+                  </pic:nvPicPr>
+                  <pic:blipFill>
+                    <a:blip r:embed="rId12"/>
+                    <a:stretch>
+                      <a:fillRect/>
+                    </a:stretch>
+                  </pic:blipFill>
+                  <pic:spPr>
+                    <a:xfrm>
+                      <a:off x="0" y="0"/>
+                      <a:ext cx="6126480" cy="3185770"/>
+                    </a:xfrm>
+                    <a:prstGeom prst="rect"/>
+                  </pic:spPr>
+                </pic:pic>
+              </a:graphicData>
+            </a:graphic>
+          </wp:inline>
+        </w:drawing>
+      </w:r>
+    </w:p>
+    <w:p>
+      <w:r>
+        <w:t>Proposed configuration walkthrough: (1) confirm the process owner, approval policy, material/plant scope and roles; (2) verify master-data prerequisites and approved units; (3) document purchasing approval, receipt tolerance and planning parameters; (4) map each decision to product-specific configuration only after fit-to-standard approval; (5) review normal, boundary and exception cases; and (6) obtain procurement, finance, warehouse, planning and security sign-off. These are planning steps, not steps executed in software.</w:t>
+      </w:r>
+    </w:p>
+    <w:p>
+      <w:r>
+        <w:t>The validation register contains eight desk-checked rule scenarios: approval thresholds, self-approval prevention, the exact 2% boundary, above-tolerance receipt, known/unknown units, and production release with a shortage. All 8/8 pass the documented rule walkthrough. This checks consistency of the proposed rules on paper; it is not a system test or proof of configured behavior.</w:t>
       </w:r>
     </w:p>
     <w:p>

</xml_diff>